<commit_message>
Clarify Windows workstation setup automation
</commit_message>
<xml_diff>
--- a/odigoi/01_workstation_setup.docx
+++ b/odigoi/01_workstation_setup.docx
@@ -61,7 +61,7 @@
           <w:r>
             <w:fldChar w:fldCharType="separate"/>
           </w:r>
-          <w:hyperlink w:anchor="_Toc225623719" w:history="1">
+          <w:hyperlink w:anchor="_Toc225624628" w:history="1">
             <w:r>
               <w:rPr>
                 <w:rStyle w:val="Hyperlink"/>
@@ -88,7 +88,7 @@
                 <w:noProof/>
                 <w:webHidden/>
               </w:rPr>
-              <w:instrText xml:space="preserve"> PAGEREF _Toc225623719 \h </w:instrText>
+              <w:instrText xml:space="preserve"> PAGEREF _Toc225624628 \h </w:instrText>
             </w:r>
             <w:r>
               <w:rPr>
@@ -135,7 +135,7 @@
               <w14:ligatures w14:val="standardContextual"/>
             </w:rPr>
           </w:pPr>
-          <w:hyperlink w:anchor="_Toc225623720" w:history="1">
+          <w:hyperlink w:anchor="_Toc225624629" w:history="1">
             <w:r>
               <w:rPr>
                 <w:rStyle w:val="Hyperlink"/>
@@ -162,7 +162,7 @@
                 <w:noProof/>
                 <w:webHidden/>
               </w:rPr>
-              <w:instrText xml:space="preserve"> PAGEREF _Toc225623720 \h </w:instrText>
+              <w:instrText xml:space="preserve"> PAGEREF _Toc225624629 \h </w:instrText>
             </w:r>
             <w:r>
               <w:rPr>
@@ -209,7 +209,7 @@
               <w14:ligatures w14:val="standardContextual"/>
             </w:rPr>
           </w:pPr>
-          <w:hyperlink w:anchor="_Toc225623721" w:history="1">
+          <w:hyperlink w:anchor="_Toc225624630" w:history="1">
             <w:r>
               <w:rPr>
                 <w:rStyle w:val="Hyperlink"/>
@@ -236,7 +236,7 @@
                 <w:noProof/>
                 <w:webHidden/>
               </w:rPr>
-              <w:instrText xml:space="preserve"> PAGEREF _Toc225623721 \h </w:instrText>
+              <w:instrText xml:space="preserve"> PAGEREF _Toc225624630 \h </w:instrText>
             </w:r>
             <w:r>
               <w:rPr>
@@ -283,7 +283,7 @@
               <w14:ligatures w14:val="standardContextual"/>
             </w:rPr>
           </w:pPr>
-          <w:hyperlink w:anchor="_Toc225623722" w:history="1">
+          <w:hyperlink w:anchor="_Toc225624631" w:history="1">
             <w:r>
               <w:rPr>
                 <w:rStyle w:val="Hyperlink"/>
@@ -310,7 +310,7 @@
                 <w:noProof/>
                 <w:webHidden/>
               </w:rPr>
-              <w:instrText xml:space="preserve"> PAGEREF _Toc225623722 \h </w:instrText>
+              <w:instrText xml:space="preserve"> PAGEREF _Toc225624631 \h </w:instrText>
             </w:r>
             <w:r>
               <w:rPr>
@@ -357,7 +357,7 @@
               <w14:ligatures w14:val="standardContextual"/>
             </w:rPr>
           </w:pPr>
-          <w:hyperlink w:anchor="_Toc225623723" w:history="1">
+          <w:hyperlink w:anchor="_Toc225624632" w:history="1">
             <w:r>
               <w:rPr>
                 <w:rStyle w:val="Hyperlink"/>
@@ -384,7 +384,7 @@
                 <w:noProof/>
                 <w:webHidden/>
               </w:rPr>
-              <w:instrText xml:space="preserve"> PAGEREF _Toc225623723 \h </w:instrText>
+              <w:instrText xml:space="preserve"> PAGEREF _Toc225624632 \h </w:instrText>
             </w:r>
             <w:r>
               <w:rPr>
@@ -431,7 +431,7 @@
               <w14:ligatures w14:val="standardContextual"/>
             </w:rPr>
           </w:pPr>
-          <w:hyperlink w:anchor="_Toc225623724" w:history="1">
+          <w:hyperlink w:anchor="_Toc225624633" w:history="1">
             <w:r>
               <w:rPr>
                 <w:rStyle w:val="Hyperlink"/>
@@ -458,7 +458,7 @@
                 <w:noProof/>
                 <w:webHidden/>
               </w:rPr>
-              <w:instrText xml:space="preserve"> PAGEREF _Toc225623724 \h </w:instrText>
+              <w:instrText xml:space="preserve"> PAGEREF _Toc225624633 \h </w:instrText>
             </w:r>
             <w:r>
               <w:rPr>
@@ -505,7 +505,7 @@
               <w14:ligatures w14:val="standardContextual"/>
             </w:rPr>
           </w:pPr>
-          <w:hyperlink w:anchor="_Toc225623725" w:history="1">
+          <w:hyperlink w:anchor="_Toc225624634" w:history="1">
             <w:r>
               <w:rPr>
                 <w:rStyle w:val="Hyperlink"/>
@@ -532,7 +532,7 @@
                 <w:noProof/>
                 <w:webHidden/>
               </w:rPr>
-              <w:instrText xml:space="preserve"> PAGEREF _Toc225623725 \h </w:instrText>
+              <w:instrText xml:space="preserve"> PAGEREF _Toc225624634 \h </w:instrText>
             </w:r>
             <w:r>
               <w:rPr>
@@ -579,7 +579,7 @@
               <w14:ligatures w14:val="standardContextual"/>
             </w:rPr>
           </w:pPr>
-          <w:hyperlink w:anchor="_Toc225623726" w:history="1">
+          <w:hyperlink w:anchor="_Toc225624635" w:history="1">
             <w:r>
               <w:rPr>
                 <w:rStyle w:val="Hyperlink"/>
@@ -606,7 +606,7 @@
                 <w:noProof/>
                 <w:webHidden/>
               </w:rPr>
-              <w:instrText xml:space="preserve"> PAGEREF _Toc225623726 \h </w:instrText>
+              <w:instrText xml:space="preserve"> PAGEREF _Toc225624635 \h </w:instrText>
             </w:r>
             <w:r>
               <w:rPr>
@@ -653,7 +653,7 @@
               <w14:ligatures w14:val="standardContextual"/>
             </w:rPr>
           </w:pPr>
-          <w:hyperlink w:anchor="_Toc225623727" w:history="1">
+          <w:hyperlink w:anchor="_Toc225624636" w:history="1">
             <w:r>
               <w:rPr>
                 <w:rStyle w:val="Hyperlink"/>
@@ -689,7 +689,7 @@
                 <w:noProof/>
                 <w:webHidden/>
               </w:rPr>
-              <w:instrText xml:space="preserve"> PAGEREF _Toc225623727 \h </w:instrText>
+              <w:instrText xml:space="preserve"> PAGEREF _Toc225624636 \h </w:instrText>
             </w:r>
             <w:r>
               <w:rPr>
@@ -736,7 +736,7 @@
               <w14:ligatures w14:val="standardContextual"/>
             </w:rPr>
           </w:pPr>
-          <w:hyperlink w:anchor="_Toc225623728" w:history="1">
+          <w:hyperlink w:anchor="_Toc225624637" w:history="1">
             <w:r>
               <w:rPr>
                 <w:rStyle w:val="Hyperlink"/>
@@ -763,7 +763,7 @@
                 <w:noProof/>
                 <w:webHidden/>
               </w:rPr>
-              <w:instrText xml:space="preserve"> PAGEREF _Toc225623728 \h </w:instrText>
+              <w:instrText xml:space="preserve"> PAGEREF _Toc225624637 \h </w:instrText>
             </w:r>
             <w:r>
               <w:rPr>
@@ -810,7 +810,7 @@
               <w14:ligatures w14:val="standardContextual"/>
             </w:rPr>
           </w:pPr>
-          <w:hyperlink w:anchor="_Toc225623729" w:history="1">
+          <w:hyperlink w:anchor="_Toc225624638" w:history="1">
             <w:r>
               <w:rPr>
                 <w:rStyle w:val="Hyperlink"/>
@@ -837,7 +837,7 @@
                 <w:noProof/>
                 <w:webHidden/>
               </w:rPr>
-              <w:instrText xml:space="preserve"> PAGEREF _Toc225623729 \h </w:instrText>
+              <w:instrText xml:space="preserve"> PAGEREF _Toc225624638 \h </w:instrText>
             </w:r>
             <w:r>
               <w:rPr>
@@ -884,7 +884,7 @@
               <w14:ligatures w14:val="standardContextual"/>
             </w:rPr>
           </w:pPr>
-          <w:hyperlink w:anchor="_Toc225623730" w:history="1">
+          <w:hyperlink w:anchor="_Toc225624639" w:history="1">
             <w:r>
               <w:rPr>
                 <w:rStyle w:val="Hyperlink"/>
@@ -911,7 +911,7 @@
                 <w:noProof/>
                 <w:webHidden/>
               </w:rPr>
-              <w:instrText xml:space="preserve"> PAGEREF _Toc225623730 \h </w:instrText>
+              <w:instrText xml:space="preserve"> PAGEREF _Toc225624639 \h </w:instrText>
             </w:r>
             <w:r>
               <w:rPr>
@@ -958,7 +958,7 @@
               <w14:ligatures w14:val="standardContextual"/>
             </w:rPr>
           </w:pPr>
-          <w:hyperlink w:anchor="_Toc225623731" w:history="1">
+          <w:hyperlink w:anchor="_Toc225624640" w:history="1">
             <w:r>
               <w:rPr>
                 <w:rStyle w:val="Hyperlink"/>
@@ -985,7 +985,7 @@
                 <w:noProof/>
                 <w:webHidden/>
               </w:rPr>
-              <w:instrText xml:space="preserve"> PAGEREF _Toc225623731 \h </w:instrText>
+              <w:instrText xml:space="preserve"> PAGEREF _Toc225624640 \h </w:instrText>
             </w:r>
             <w:r>
               <w:rPr>
@@ -1033,7 +1033,7 @@
         <w:pStyle w:val="Heading1"/>
       </w:pPr>
       <w:bookmarkStart w:id="0" w:name="X4dd9fbe08777ef1289ff22573c7e3f439118723"/>
-      <w:bookmarkStart w:id="1" w:name="_Toc225623719"/>
+      <w:bookmarkStart w:id="1" w:name="_Toc225624628"/>
       <w:r>
         <w:t>Ενεργοποίηση WSL και Virtual Machine Platform</w:t>
       </w:r>
@@ -1302,7 +1302,7 @@
         <w:pStyle w:val="Heading1"/>
       </w:pPr>
       <w:bookmarkStart w:id="2" w:name="ρύθμιση-του-ubuntu"/>
-      <w:bookmarkStart w:id="3" w:name="_Toc225623720"/>
+      <w:bookmarkStart w:id="3" w:name="_Toc225624629"/>
       <w:bookmarkEnd w:id="0"/>
       <w:r>
         <w:t>Ρύθμιση του Ubuntu</w:t>
@@ -1444,7 +1444,7 @@
         <w:pStyle w:val="Heading1"/>
       </w:pPr>
       <w:bookmarkStart w:id="4" w:name="αναβάθμιση-και-ενημερώσεις"/>
-      <w:bookmarkStart w:id="5" w:name="_Toc225623721"/>
+      <w:bookmarkStart w:id="5" w:name="_Toc225624630"/>
       <w:bookmarkEnd w:id="2"/>
       <w:r>
         <w:t>Αναβάθμιση και ενημερώσεις</w:t>
@@ -1776,7 +1776,7 @@
         <w:pStyle w:val="Heading1"/>
       </w:pPr>
       <w:bookmarkStart w:id="6" w:name="εγκατάσταση-docker-desktop"/>
-      <w:bookmarkStart w:id="7" w:name="_Toc225623722"/>
+      <w:bookmarkStart w:id="7" w:name="_Toc225624631"/>
       <w:bookmarkEnd w:id="4"/>
       <w:r>
         <w:t>Εγκατάσταση Docker Desktop</w:t>
@@ -2611,7 +2611,7 @@
         <w:pStyle w:val="Heading1"/>
       </w:pPr>
       <w:bookmarkStart w:id="8" w:name="Xb171393346700e54c36c8065d381c8c50c67c8e"/>
-      <w:bookmarkStart w:id="9" w:name="_Toc225623723"/>
+      <w:bookmarkStart w:id="9" w:name="_Toc225624632"/>
       <w:bookmarkEnd w:id="6"/>
       <w:r>
         <w:t>Εργαλεία που θα χρειαστούν στους επόμενους οδηγούς</w:t>
@@ -2736,7 +2736,7 @@
         <w:pStyle w:val="Heading2"/>
       </w:pPr>
       <w:bookmarkStart w:id="10" w:name="για-τη-διαδρομή-windows--powershell"/>
-      <w:bookmarkStart w:id="11" w:name="_Toc225623724"/>
+      <w:bookmarkStart w:id="11" w:name="_Toc225624633"/>
       <w:r>
         <w:t>Για τη διαδρομή Windows / PowerShell</w:t>
       </w:r>
@@ -3185,7 +3185,7 @@
         <w:pStyle w:val="Heading2"/>
       </w:pPr>
       <w:bookmarkStart w:id="12" w:name="X164c7c7c213ce33dfb5608473e7de326f8f0284"/>
-      <w:bookmarkStart w:id="13" w:name="_Toc225623725"/>
+      <w:bookmarkStart w:id="13" w:name="_Toc225624634"/>
       <w:bookmarkEnd w:id="10"/>
       <w:r>
         <w:t>OpenVPN client στα Windows και αρχεία πρόσβασης του εργαστηρίου</w:t>
@@ -3354,7 +3354,7 @@
         <w:pStyle w:val="Heading2"/>
       </w:pPr>
       <w:bookmarkStart w:id="14" w:name="για-τη-διαδρομή-wsl--ubuntu"/>
-      <w:bookmarkStart w:id="15" w:name="_Toc225623726"/>
+      <w:bookmarkStart w:id="15" w:name="_Toc225624635"/>
       <w:bookmarkEnd w:id="12"/>
       <w:r>
         <w:t>Για τη διαδρομή WSL / Ubuntu</w:t>
@@ -4022,7 +4022,7 @@
         <w:pStyle w:val="Heading1"/>
       </w:pPr>
       <w:bookmarkStart w:id="16" w:name="Xe261258f9b378c2bf9cf1ed2d29933bf3df61b3"/>
-      <w:bookmarkStart w:id="17" w:name="_Toc225623727"/>
+      <w:bookmarkStart w:id="17" w:name="_Toc225624636"/>
       <w:bookmarkEnd w:id="8"/>
       <w:bookmarkEnd w:id="14"/>
       <w:r>
@@ -4438,7 +4438,7 @@
         <w:pStyle w:val="Heading1"/>
       </w:pPr>
       <w:bookmarkStart w:id="18" w:name="επόμενο-βήμα-λήψη-του-repository"/>
-      <w:bookmarkStart w:id="19" w:name="_Toc225623728"/>
+      <w:bookmarkStart w:id="19" w:name="_Toc225624637"/>
       <w:bookmarkEnd w:id="16"/>
       <w:r>
         <w:t>Επόμενο βήμα: λήψη του repository</w:t>
@@ -4500,7 +4500,7 @@
         <w:pStyle w:val="Heading2"/>
       </w:pPr>
       <w:bookmarkStart w:id="20" w:name="επιλογή-α-clone-σε-φάκελο-των-windows"/>
-      <w:bookmarkStart w:id="21" w:name="_Toc225623729"/>
+      <w:bookmarkStart w:id="21" w:name="_Toc225624638"/>
       <w:r>
         <w:t>Επιλογή Α: clone σε φάκελο των Windows</w:t>
       </w:r>
@@ -4646,7 +4646,7 @@
         <w:pStyle w:val="Heading2"/>
       </w:pPr>
       <w:bookmarkStart w:id="22" w:name="επιλογή-β-clone-μέσα-στο-wsl"/>
-      <w:bookmarkStart w:id="23" w:name="_Toc225623730"/>
+      <w:bookmarkStart w:id="23" w:name="_Toc225624639"/>
       <w:bookmarkEnd w:id="20"/>
       <w:r>
         <w:t>Επιλογή Β: clone μέσα στο WSL</w:t>
@@ -4742,7 +4742,7 @@
         <w:pStyle w:val="Heading2"/>
       </w:pPr>
       <w:bookmarkStart w:id="24" w:name="τι-να-κρατήσετε"/>
-      <w:bookmarkStart w:id="25" w:name="_Toc225623731"/>
+      <w:bookmarkStart w:id="25" w:name="_Toc225624640"/>
       <w:bookmarkEnd w:id="22"/>
       <w:r>
         <w:t>Τι να κρατήσετε</w:t>

</xml_diff>

<commit_message>
Refactor Docker stacks and refresh guides
</commit_message>
<xml_diff>
--- a/odigoi/01_workstation_setup.docx
+++ b/odigoi/01_workstation_setup.docx
@@ -20,7 +20,7 @@
           <w:sz w:val="22"/>
           <w:szCs w:val="22"/>
         </w:rPr>
-        <w:id w:val="-1751735424"/>
+        <w:id w:val="-2024159483"/>
         <w:docPartObj>
           <w:docPartGallery w:val="Table of Contents"/>
           <w:docPartUnique/>
@@ -61,7 +61,7 @@
           <w:r>
             <w:fldChar w:fldCharType="separate"/>
           </w:r>
-          <w:hyperlink w:anchor="_Toc225688154" w:history="1">
+          <w:hyperlink w:anchor="_Toc225777253" w:history="1">
             <w:r>
               <w:rPr>
                 <w:rStyle w:val="Hyperlink"/>
@@ -88,7 +88,7 @@
                 <w:noProof/>
                 <w:webHidden/>
               </w:rPr>
-              <w:instrText xml:space="preserve"> PAGEREF _Toc225688154 \h </w:instrText>
+              <w:instrText xml:space="preserve"> PAGEREF _Toc225777253 \h </w:instrText>
             </w:r>
             <w:r>
               <w:rPr>
@@ -135,7 +135,7 @@
               <w14:ligatures w14:val="standardContextual"/>
             </w:rPr>
           </w:pPr>
-          <w:hyperlink w:anchor="_Toc225688155" w:history="1">
+          <w:hyperlink w:anchor="_Toc225777254" w:history="1">
             <w:r>
               <w:rPr>
                 <w:rStyle w:val="Hyperlink"/>
@@ -162,7 +162,7 @@
                 <w:noProof/>
                 <w:webHidden/>
               </w:rPr>
-              <w:instrText xml:space="preserve"> PAGEREF _Toc225688155 \h </w:instrText>
+              <w:instrText xml:space="preserve"> PAGEREF _Toc225777254 \h </w:instrText>
             </w:r>
             <w:r>
               <w:rPr>
@@ -209,7 +209,7 @@
               <w14:ligatures w14:val="standardContextual"/>
             </w:rPr>
           </w:pPr>
-          <w:hyperlink w:anchor="_Toc225688156" w:history="1">
+          <w:hyperlink w:anchor="_Toc225777255" w:history="1">
             <w:r>
               <w:rPr>
                 <w:rStyle w:val="Hyperlink"/>
@@ -236,7 +236,7 @@
                 <w:noProof/>
                 <w:webHidden/>
               </w:rPr>
-              <w:instrText xml:space="preserve"> PAGEREF _Toc225688156 \h </w:instrText>
+              <w:instrText xml:space="preserve"> PAGEREF _Toc225777255 \h </w:instrText>
             </w:r>
             <w:r>
               <w:rPr>
@@ -283,7 +283,7 @@
               <w14:ligatures w14:val="standardContextual"/>
             </w:rPr>
           </w:pPr>
-          <w:hyperlink w:anchor="_Toc225688157" w:history="1">
+          <w:hyperlink w:anchor="_Toc225777256" w:history="1">
             <w:r>
               <w:rPr>
                 <w:rStyle w:val="Hyperlink"/>
@@ -310,7 +310,7 @@
                 <w:noProof/>
                 <w:webHidden/>
               </w:rPr>
-              <w:instrText xml:space="preserve"> PAGEREF _Toc225688157 \h </w:instrText>
+              <w:instrText xml:space="preserve"> PAGEREF _Toc225777256 \h </w:instrText>
             </w:r>
             <w:r>
               <w:rPr>
@@ -357,7 +357,7 @@
               <w14:ligatures w14:val="standardContextual"/>
             </w:rPr>
           </w:pPr>
-          <w:hyperlink w:anchor="_Toc225688158" w:history="1">
+          <w:hyperlink w:anchor="_Toc225777257" w:history="1">
             <w:r>
               <w:rPr>
                 <w:rStyle w:val="Hyperlink"/>
@@ -384,7 +384,7 @@
                 <w:noProof/>
                 <w:webHidden/>
               </w:rPr>
-              <w:instrText xml:space="preserve"> PAGEREF _Toc225688158 \h </w:instrText>
+              <w:instrText xml:space="preserve"> PAGEREF _Toc225777257 \h </w:instrText>
             </w:r>
             <w:r>
               <w:rPr>
@@ -431,7 +431,7 @@
               <w14:ligatures w14:val="standardContextual"/>
             </w:rPr>
           </w:pPr>
-          <w:hyperlink w:anchor="_Toc225688159" w:history="1">
+          <w:hyperlink w:anchor="_Toc225777258" w:history="1">
             <w:r>
               <w:rPr>
                 <w:rStyle w:val="Hyperlink"/>
@@ -458,7 +458,7 @@
                 <w:noProof/>
                 <w:webHidden/>
               </w:rPr>
-              <w:instrText xml:space="preserve"> PAGEREF _Toc225688159 \h </w:instrText>
+              <w:instrText xml:space="preserve"> PAGEREF _Toc225777258 \h </w:instrText>
             </w:r>
             <w:r>
               <w:rPr>
@@ -505,7 +505,7 @@
               <w14:ligatures w14:val="standardContextual"/>
             </w:rPr>
           </w:pPr>
-          <w:hyperlink w:anchor="_Toc225688160" w:history="1">
+          <w:hyperlink w:anchor="_Toc225777259" w:history="1">
             <w:r>
               <w:rPr>
                 <w:rStyle w:val="Hyperlink"/>
@@ -532,7 +532,7 @@
                 <w:noProof/>
                 <w:webHidden/>
               </w:rPr>
-              <w:instrText xml:space="preserve"> PAGEREF _Toc225688160 \h </w:instrText>
+              <w:instrText xml:space="preserve"> PAGEREF _Toc225777259 \h </w:instrText>
             </w:r>
             <w:r>
               <w:rPr>
@@ -579,7 +579,7 @@
               <w14:ligatures w14:val="standardContextual"/>
             </w:rPr>
           </w:pPr>
-          <w:hyperlink w:anchor="_Toc225688161" w:history="1">
+          <w:hyperlink w:anchor="_Toc225777260" w:history="1">
             <w:r>
               <w:rPr>
                 <w:rStyle w:val="Hyperlink"/>
@@ -606,7 +606,7 @@
                 <w:noProof/>
                 <w:webHidden/>
               </w:rPr>
-              <w:instrText xml:space="preserve"> PAGEREF _Toc225688161 \h </w:instrText>
+              <w:instrText xml:space="preserve"> PAGEREF _Toc225777260 \h </w:instrText>
             </w:r>
             <w:r>
               <w:rPr>
@@ -653,7 +653,7 @@
               <w14:ligatures w14:val="standardContextual"/>
             </w:rPr>
           </w:pPr>
-          <w:hyperlink w:anchor="_Toc225688162" w:history="1">
+          <w:hyperlink w:anchor="_Toc225777261" w:history="1">
             <w:r>
               <w:rPr>
                 <w:rStyle w:val="Hyperlink"/>
@@ -680,7 +680,7 @@
                 <w:noProof/>
                 <w:webHidden/>
               </w:rPr>
-              <w:instrText xml:space="preserve"> PAGEREF _Toc225688162 \h </w:instrText>
+              <w:instrText xml:space="preserve"> PAGEREF _Toc225777261 \h </w:instrText>
             </w:r>
             <w:r>
               <w:rPr>
@@ -727,7 +727,7 @@
               <w14:ligatures w14:val="standardContextual"/>
             </w:rPr>
           </w:pPr>
-          <w:hyperlink w:anchor="_Toc225688163" w:history="1">
+          <w:hyperlink w:anchor="_Toc225777262" w:history="1">
             <w:r>
               <w:rPr>
                 <w:rStyle w:val="Hyperlink"/>
@@ -754,7 +754,7 @@
                 <w:noProof/>
                 <w:webHidden/>
               </w:rPr>
-              <w:instrText xml:space="preserve"> PAGEREF _Toc225688163 \h </w:instrText>
+              <w:instrText xml:space="preserve"> PAGEREF _Toc225777262 \h </w:instrText>
             </w:r>
             <w:r>
               <w:rPr>
@@ -801,7 +801,7 @@
               <w14:ligatures w14:val="standardContextual"/>
             </w:rPr>
           </w:pPr>
-          <w:hyperlink w:anchor="_Toc225688164" w:history="1">
+          <w:hyperlink w:anchor="_Toc225777263" w:history="1">
             <w:r>
               <w:rPr>
                 <w:rStyle w:val="Hyperlink"/>
@@ -828,7 +828,7 @@
                 <w:noProof/>
                 <w:webHidden/>
               </w:rPr>
-              <w:instrText xml:space="preserve"> PAGEREF _Toc225688164 \h </w:instrText>
+              <w:instrText xml:space="preserve"> PAGEREF _Toc225777263 \h </w:instrText>
             </w:r>
             <w:r>
               <w:rPr>
@@ -875,7 +875,7 @@
               <w14:ligatures w14:val="standardContextual"/>
             </w:rPr>
           </w:pPr>
-          <w:hyperlink w:anchor="_Toc225688165" w:history="1">
+          <w:hyperlink w:anchor="_Toc225777264" w:history="1">
             <w:r>
               <w:rPr>
                 <w:rStyle w:val="Hyperlink"/>
@@ -911,7 +911,7 @@
                 <w:noProof/>
                 <w:webHidden/>
               </w:rPr>
-              <w:instrText xml:space="preserve"> PAGEREF _Toc225688165 \h </w:instrText>
+              <w:instrText xml:space="preserve"> PAGEREF _Toc225777264 \h </w:instrText>
             </w:r>
             <w:r>
               <w:rPr>
@@ -958,7 +958,7 @@
               <w14:ligatures w14:val="standardContextual"/>
             </w:rPr>
           </w:pPr>
-          <w:hyperlink w:anchor="_Toc225688166" w:history="1">
+          <w:hyperlink w:anchor="_Toc225777265" w:history="1">
             <w:r>
               <w:rPr>
                 <w:rStyle w:val="Hyperlink"/>
@@ -985,7 +985,7 @@
                 <w:noProof/>
                 <w:webHidden/>
               </w:rPr>
-              <w:instrText xml:space="preserve"> PAGEREF _Toc225688166 \h </w:instrText>
+              <w:instrText xml:space="preserve"> PAGEREF _Toc225777265 \h </w:instrText>
             </w:r>
             <w:r>
               <w:rPr>
@@ -1032,7 +1032,7 @@
               <w14:ligatures w14:val="standardContextual"/>
             </w:rPr>
           </w:pPr>
-          <w:hyperlink w:anchor="_Toc225688167" w:history="1">
+          <w:hyperlink w:anchor="_Toc225777266" w:history="1">
             <w:r>
               <w:rPr>
                 <w:rStyle w:val="Hyperlink"/>
@@ -1059,7 +1059,7 @@
                 <w:noProof/>
                 <w:webHidden/>
               </w:rPr>
-              <w:instrText xml:space="preserve"> PAGEREF _Toc225688167 \h </w:instrText>
+              <w:instrText xml:space="preserve"> PAGEREF _Toc225777266 \h </w:instrText>
             </w:r>
             <w:r>
               <w:rPr>
@@ -1106,7 +1106,7 @@
               <w14:ligatures w14:val="standardContextual"/>
             </w:rPr>
           </w:pPr>
-          <w:hyperlink w:anchor="_Toc225688168" w:history="1">
+          <w:hyperlink w:anchor="_Toc225777267" w:history="1">
             <w:r>
               <w:rPr>
                 <w:rStyle w:val="Hyperlink"/>
@@ -1133,7 +1133,7 @@
                 <w:noProof/>
                 <w:webHidden/>
               </w:rPr>
-              <w:instrText xml:space="preserve"> PAGEREF _Toc225688168 \h </w:instrText>
+              <w:instrText xml:space="preserve"> PAGEREF _Toc225777267 \h </w:instrText>
             </w:r>
             <w:r>
               <w:rPr>
@@ -1180,7 +1180,7 @@
               <w14:ligatures w14:val="standardContextual"/>
             </w:rPr>
           </w:pPr>
-          <w:hyperlink w:anchor="_Toc225688169" w:history="1">
+          <w:hyperlink w:anchor="_Toc225777268" w:history="1">
             <w:r>
               <w:rPr>
                 <w:rStyle w:val="Hyperlink"/>
@@ -1207,7 +1207,7 @@
                 <w:noProof/>
                 <w:webHidden/>
               </w:rPr>
-              <w:instrText xml:space="preserve"> PAGEREF _Toc225688169 \h </w:instrText>
+              <w:instrText xml:space="preserve"> PAGEREF _Toc225777268 \h </w:instrText>
             </w:r>
             <w:r>
               <w:rPr>
@@ -1255,7 +1255,7 @@
         <w:pStyle w:val="Heading1"/>
       </w:pPr>
       <w:bookmarkStart w:id="0" w:name="X4dd9fbe08777ef1289ff22573c7e3f439118723"/>
-      <w:bookmarkStart w:id="1" w:name="_Toc225688154"/>
+      <w:bookmarkStart w:id="1" w:name="_Toc225777253"/>
       <w:r>
         <w:t>Ενεργοποίηση WSL και Virtual Machine Platform</w:t>
       </w:r>
@@ -1310,7 +1310,7 @@
         </w:rPr>
         <w:lastRenderedPageBreak/>
         <w:drawing>
-          <wp:inline distT="0" distB="0" distL="0" distR="0" wp14:anchorId="545E6848" wp14:editId="44D3694C">
+          <wp:inline distT="0" distB="0" distL="0" distR="0" wp14:anchorId="3526A684" wp14:editId="26CEE634">
             <wp:extent cx="4398745" cy="6429675"/>
             <wp:effectExtent l="0" t="0" r="0" b="0"/>
             <wp:docPr id="22" name="Picture" descr="Εικόνα 1"/>
@@ -1441,7 +1441,7 @@
         </w:rPr>
         <w:lastRenderedPageBreak/>
         <w:drawing>
-          <wp:inline distT="0" distB="0" distL="0" distR="0" wp14:anchorId="7D7B6BF6" wp14:editId="02E9B707">
+          <wp:inline distT="0" distB="0" distL="0" distR="0" wp14:anchorId="6A6220F8" wp14:editId="5197C041">
             <wp:extent cx="6692900" cy="3783205"/>
             <wp:effectExtent l="0" t="0" r="0" b="0"/>
             <wp:docPr id="25" name="Picture" descr="Εικόνα 2"/>
@@ -1492,7 +1492,7 @@
           <w:noProof/>
         </w:rPr>
         <w:drawing>
-          <wp:inline distT="0" distB="0" distL="0" distR="0" wp14:anchorId="5B1F485B" wp14:editId="5A27A978">
+          <wp:inline distT="0" distB="0" distL="0" distR="0" wp14:anchorId="45B7689C" wp14:editId="28351133">
             <wp:extent cx="6692900" cy="912378"/>
             <wp:effectExtent l="0" t="0" r="0" b="0"/>
             <wp:docPr id="28" name="Picture" descr="Εικόνα 2"/>
@@ -1588,7 +1588,7 @@
         <w:pStyle w:val="Heading2"/>
       </w:pPr>
       <w:bookmarkStart w:id="2" w:name="X16ac49483153b83d03411f3fca6b9347554c86b"/>
-      <w:bookmarkStart w:id="3" w:name="_Toc225688155"/>
+      <w:bookmarkStart w:id="3" w:name="_Toc225777254"/>
       <w:r>
         <w:t>Προαιρετική σημείωση για όσους δοκιμάζουν τον οδηγό μέσα σε Hyper-V VM</w:t>
       </w:r>
@@ -1951,7 +1951,7 @@
         <w:pStyle w:val="Heading1"/>
       </w:pPr>
       <w:bookmarkStart w:id="4" w:name="ρύθμιση-του-ubuntu"/>
-      <w:bookmarkStart w:id="5" w:name="_Toc225688156"/>
+      <w:bookmarkStart w:id="5" w:name="_Toc225777255"/>
       <w:bookmarkEnd w:id="0"/>
       <w:bookmarkEnd w:id="2"/>
       <w:r>
@@ -1987,7 +1987,7 @@
           <w:noProof/>
         </w:rPr>
         <w:drawing>
-          <wp:inline distT="0" distB="0" distL="0" distR="0" wp14:anchorId="3E9D4C57" wp14:editId="33868717">
+          <wp:inline distT="0" distB="0" distL="0" distR="0" wp14:anchorId="16E193EB" wp14:editId="66F44F4C">
             <wp:extent cx="6063915" cy="4032985"/>
             <wp:effectExtent l="0" t="0" r="0" b="0"/>
             <wp:docPr id="33" name="Picture" descr="Εικόνα 4"/>
@@ -2054,7 +2054,7 @@
         </w:rPr>
         <w:lastRenderedPageBreak/>
         <w:drawing>
-          <wp:inline distT="0" distB="0" distL="0" distR="0" wp14:anchorId="4AF93CE5" wp14:editId="56A1F83A">
+          <wp:inline distT="0" distB="0" distL="0" distR="0" wp14:anchorId="459307E7" wp14:editId="34A2F4F9">
             <wp:extent cx="6692900" cy="834345"/>
             <wp:effectExtent l="0" t="0" r="0" b="0"/>
             <wp:docPr id="36" name="Picture" descr="Εικόνα 7"/>
@@ -2101,7 +2101,7 @@
         <w:pStyle w:val="Heading1"/>
       </w:pPr>
       <w:bookmarkStart w:id="6" w:name="αναβάθμιση-και-ενημερώσεις"/>
-      <w:bookmarkStart w:id="7" w:name="_Toc225688157"/>
+      <w:bookmarkStart w:id="7" w:name="_Toc225777256"/>
       <w:bookmarkEnd w:id="4"/>
       <w:r>
         <w:t>Αναβάθμιση και ενημερώσεις</w:t>
@@ -2233,7 +2233,7 @@
           <w:noProof/>
         </w:rPr>
         <w:drawing>
-          <wp:inline distT="0" distB="0" distL="0" distR="0" wp14:anchorId="1EBCBD83" wp14:editId="49BF0868">
+          <wp:inline distT="0" distB="0" distL="0" distR="0" wp14:anchorId="6A9CB5F1" wp14:editId="18FCD551">
             <wp:extent cx="4321743" cy="750770"/>
             <wp:effectExtent l="0" t="0" r="0" b="0"/>
             <wp:docPr id="40" name="Picture" descr="Εικόνα 2"/>
@@ -2477,7 +2477,7 @@
         <w:pStyle w:val="Heading1"/>
       </w:pPr>
       <w:bookmarkStart w:id="8" w:name="εγκατάσταση-docker-στο-wsl"/>
-      <w:bookmarkStart w:id="9" w:name="_Toc225688158"/>
+      <w:bookmarkStart w:id="9" w:name="_Toc225777257"/>
       <w:bookmarkEnd w:id="6"/>
       <w:r>
         <w:t>Εγκατάσταση Docker στο WSL</w:t>
@@ -2562,7 +2562,7 @@
         <w:pStyle w:val="Heading2"/>
       </w:pPr>
       <w:bookmarkStart w:id="10" w:name="προτεινόμενη-διαδρομή-docker-desktop"/>
-      <w:bookmarkStart w:id="11" w:name="_Toc225688159"/>
+      <w:bookmarkStart w:id="11" w:name="_Toc225777258"/>
       <w:r>
         <w:lastRenderedPageBreak/>
         <w:t>Προτεινόμενη διαδρομή: Docker Desktop</w:t>
@@ -2608,7 +2608,7 @@
           <w:noProof/>
         </w:rPr>
         <w:drawing>
-          <wp:inline distT="0" distB="0" distL="0" distR="0" wp14:anchorId="40B25200" wp14:editId="1400AA23">
+          <wp:inline distT="0" distB="0" distL="0" distR="0" wp14:anchorId="36903415" wp14:editId="552AD12F">
             <wp:extent cx="6692900" cy="4471964"/>
             <wp:effectExtent l="0" t="0" r="0" b="0"/>
             <wp:docPr id="45" name="Picture" descr="Εικόνα 18"/>
@@ -2692,7 +2692,7 @@
           <w:noProof/>
         </w:rPr>
         <w:drawing>
-          <wp:inline distT="0" distB="0" distL="0" distR="0" wp14:anchorId="788BB5E9" wp14:editId="22CEAA80">
+          <wp:inline distT="0" distB="0" distL="0" distR="0" wp14:anchorId="66A7E3D2" wp14:editId="51DBD0C5">
             <wp:extent cx="6692900" cy="1599019"/>
             <wp:effectExtent l="0" t="0" r="0" b="0"/>
             <wp:docPr id="48" name="Picture" descr="Εικόνα 11"/>
@@ -2787,7 +2787,7 @@
           <w:noProof/>
         </w:rPr>
         <w:drawing>
-          <wp:inline distT="0" distB="0" distL="0" distR="0" wp14:anchorId="6D6FB7E7" wp14:editId="71EF1D17">
+          <wp:inline distT="0" distB="0" distL="0" distR="0" wp14:anchorId="78E4FB77" wp14:editId="039005A3">
             <wp:extent cx="6692900" cy="4615132"/>
             <wp:effectExtent l="0" t="0" r="0" b="0"/>
             <wp:docPr id="51" name="Picture" descr="Εικόνα 8"/>
@@ -2846,7 +2846,7 @@
           <w:noProof/>
         </w:rPr>
         <w:drawing>
-          <wp:inline distT="0" distB="0" distL="0" distR="0" wp14:anchorId="7D3BE513" wp14:editId="7DD0157E">
+          <wp:inline distT="0" distB="0" distL="0" distR="0" wp14:anchorId="4734E600" wp14:editId="53687926">
             <wp:extent cx="6692900" cy="2919863"/>
             <wp:effectExtent l="0" t="0" r="0" b="0"/>
             <wp:docPr id="54" name="Picture" descr="Εικόνα 3"/>
@@ -2989,7 +2989,7 @@
           <w:noProof/>
         </w:rPr>
         <w:drawing>
-          <wp:inline distT="0" distB="0" distL="0" distR="0" wp14:anchorId="32D56BE6" wp14:editId="40992A66">
+          <wp:inline distT="0" distB="0" distL="0" distR="0" wp14:anchorId="69FC76E7" wp14:editId="156A5C6E">
             <wp:extent cx="6692900" cy="3622664"/>
             <wp:effectExtent l="0" t="0" r="0" b="0"/>
             <wp:docPr id="57" name="Picture" descr="Εικόνα 21"/>
@@ -3066,7 +3066,7 @@
         </w:rPr>
         <w:lastRenderedPageBreak/>
         <w:drawing>
-          <wp:inline distT="0" distB="0" distL="0" distR="0" wp14:anchorId="4EFC6EB5" wp14:editId="453005EC">
+          <wp:inline distT="0" distB="0" distL="0" distR="0" wp14:anchorId="2C6899A4" wp14:editId="43DAEC77">
             <wp:extent cx="6692900" cy="4142408"/>
             <wp:effectExtent l="0" t="0" r="0" b="0"/>
             <wp:docPr id="60" name="Picture" descr="Εικόνα 12"/>
@@ -3192,7 +3192,7 @@
           <w:noProof/>
         </w:rPr>
         <w:drawing>
-          <wp:inline distT="0" distB="0" distL="0" distR="0" wp14:anchorId="5E60055A" wp14:editId="24BA26A3">
+          <wp:inline distT="0" distB="0" distL="0" distR="0" wp14:anchorId="40AE5A70" wp14:editId="7BD03FEB">
             <wp:extent cx="4918509" cy="952901"/>
             <wp:effectExtent l="0" t="0" r="0" b="0"/>
             <wp:docPr id="63" name="Picture" descr="Εικόνα 5"/>
@@ -3277,7 +3277,7 @@
           <w:noProof/>
         </w:rPr>
         <w:drawing>
-          <wp:inline distT="0" distB="0" distL="0" distR="0" wp14:anchorId="146905FF" wp14:editId="1C17C5C1">
+          <wp:inline distT="0" distB="0" distL="0" distR="0" wp14:anchorId="7F311447" wp14:editId="18E3D604">
             <wp:extent cx="6692900" cy="4431561"/>
             <wp:effectExtent l="0" t="0" r="0" b="0"/>
             <wp:docPr id="66" name="Picture" descr="Εικόνα 25"/>
@@ -3399,7 +3399,7 @@
         <w:pStyle w:val="Heading2"/>
       </w:pPr>
       <w:bookmarkStart w:id="12" w:name="X652a91baeda68442877bd0e6806f00b30d9ee40"/>
-      <w:bookmarkStart w:id="13" w:name="_Toc225688160"/>
+      <w:bookmarkStart w:id="13" w:name="_Toc225777259"/>
       <w:bookmarkEnd w:id="10"/>
       <w:r>
         <w:t>Προαιρετική advanced εναλλακτική: native Docker Engine μέσα στο WSL</w:t>
@@ -4170,7 +4170,7 @@
         <w:pStyle w:val="Heading1"/>
       </w:pPr>
       <w:bookmarkStart w:id="14" w:name="Xb171393346700e54c36c8065d381c8c50c67c8e"/>
-      <w:bookmarkStart w:id="15" w:name="_Toc225688161"/>
+      <w:bookmarkStart w:id="15" w:name="_Toc225777260"/>
       <w:bookmarkEnd w:id="8"/>
       <w:bookmarkEnd w:id="12"/>
       <w:r>
@@ -4296,7 +4296,7 @@
         <w:pStyle w:val="Heading2"/>
       </w:pPr>
       <w:bookmarkStart w:id="16" w:name="για-τη-διαδρομή-windows--powershell"/>
-      <w:bookmarkStart w:id="17" w:name="_Toc225688162"/>
+      <w:bookmarkStart w:id="17" w:name="_Toc225777261"/>
       <w:r>
         <w:t>Για τη διαδρομή Windows / PowerShell</w:t>
       </w:r>
@@ -4841,7 +4841,7 @@
         <w:pStyle w:val="Heading2"/>
       </w:pPr>
       <w:bookmarkStart w:id="18" w:name="X164c7c7c213ce33dfb5608473e7de326f8f0284"/>
-      <w:bookmarkStart w:id="19" w:name="_Toc225688163"/>
+      <w:bookmarkStart w:id="19" w:name="_Toc225777262"/>
       <w:bookmarkEnd w:id="16"/>
       <w:r>
         <w:t>OpenVPN client στα Windows και αρχεία πρόσβασης του εργαστηρίου</w:t>
@@ -5010,7 +5010,7 @@
         <w:pStyle w:val="Heading2"/>
       </w:pPr>
       <w:bookmarkStart w:id="20" w:name="για-τη-διαδρομή-wsl--ubuntu"/>
-      <w:bookmarkStart w:id="21" w:name="_Toc225688164"/>
+      <w:bookmarkStart w:id="21" w:name="_Toc225777263"/>
       <w:bookmarkEnd w:id="18"/>
       <w:r>
         <w:t>Για τη διαδρομή WSL / Ubuntu</w:t>
@@ -5678,7 +5678,7 @@
         <w:pStyle w:val="Heading1"/>
       </w:pPr>
       <w:bookmarkStart w:id="22" w:name="Xe261258f9b378c2bf9cf1ed2d29933bf3df61b3"/>
-      <w:bookmarkStart w:id="23" w:name="_Toc225688165"/>
+      <w:bookmarkStart w:id="23" w:name="_Toc225777264"/>
       <w:bookmarkEnd w:id="14"/>
       <w:bookmarkEnd w:id="20"/>
       <w:r>
@@ -6093,7 +6093,7 @@
         <w:pStyle w:val="Heading1"/>
       </w:pPr>
       <w:bookmarkStart w:id="24" w:name="επόμενο-βήμα-λήψη-του-repository"/>
-      <w:bookmarkStart w:id="25" w:name="_Toc225688166"/>
+      <w:bookmarkStart w:id="25" w:name="_Toc225777265"/>
       <w:bookmarkEnd w:id="22"/>
       <w:r>
         <w:lastRenderedPageBreak/>
@@ -6156,7 +6156,7 @@
         <w:pStyle w:val="Heading2"/>
       </w:pPr>
       <w:bookmarkStart w:id="26" w:name="επιλογή-α-clone-σε-φάκελο-των-windows"/>
-      <w:bookmarkStart w:id="27" w:name="_Toc225688167"/>
+      <w:bookmarkStart w:id="27" w:name="_Toc225777266"/>
       <w:r>
         <w:t>Επιλογή Α: clone σε φάκελο των Windows</w:t>
       </w:r>
@@ -6302,7 +6302,7 @@
         <w:pStyle w:val="Heading2"/>
       </w:pPr>
       <w:bookmarkStart w:id="28" w:name="επιλογή-β-clone-μέσα-στο-wsl"/>
-      <w:bookmarkStart w:id="29" w:name="_Toc225688168"/>
+      <w:bookmarkStart w:id="29" w:name="_Toc225777267"/>
       <w:bookmarkEnd w:id="26"/>
       <w:r>
         <w:t>Επιλογή Β: clone μέσα στο WSL</w:t>
@@ -6398,7 +6398,7 @@
         <w:pStyle w:val="Heading2"/>
       </w:pPr>
       <w:bookmarkStart w:id="30" w:name="τι-να-κρατήσετε"/>
-      <w:bookmarkStart w:id="31" w:name="_Toc225688169"/>
+      <w:bookmarkStart w:id="31" w:name="_Toc225777268"/>
       <w:bookmarkEnd w:id="28"/>
       <w:r>
         <w:t>Τι να κρατήσετε</w:t>
@@ -6905,7 +6905,7 @@
   <w:abstractNum w:abstractNumId="9" w15:restartNumberingAfterBreak="0">
     <w:nsid w:val="0000A990"/>
     <w:multiLevelType w:val="multilevel"/>
-    <w:tmpl w:val="88220D04"/>
+    <w:tmpl w:val="43068CAA"/>
     <w:lvl w:ilvl="0">
       <w:numFmt w:val="bullet"/>
       <w:lvlText w:val=" "/>
@@ -6982,7 +6982,7 @@
   <w:abstractNum w:abstractNumId="10" w15:restartNumberingAfterBreak="0">
     <w:nsid w:val="0000A991"/>
     <w:multiLevelType w:val="multilevel"/>
-    <w:tmpl w:val="AC56E4DE"/>
+    <w:tmpl w:val="D7F4505E"/>
     <w:lvl w:ilvl="0">
       <w:numFmt w:val="bullet"/>
       <w:lvlText w:val=""/>
@@ -7086,7 +7086,7 @@
   <w:abstractNum w:abstractNumId="11" w15:restartNumberingAfterBreak="0">
     <w:nsid w:val="00A99411"/>
     <w:multiLevelType w:val="multilevel"/>
-    <w:tmpl w:val="9FA276A8"/>
+    <w:tmpl w:val="C1AA0A14"/>
     <w:lvl w:ilvl="0">
       <w:start w:val="1"/>
       <w:numFmt w:val="decimal"/>
@@ -7172,7 +7172,7 @@
   <w:abstractNum w:abstractNumId="12" w15:restartNumberingAfterBreak="0">
     <w:nsid w:val="00A99413"/>
     <w:multiLevelType w:val="multilevel"/>
-    <w:tmpl w:val="EEE8C48C"/>
+    <w:tmpl w:val="DDEE80A2"/>
     <w:lvl w:ilvl="0">
       <w:start w:val="3"/>
       <w:numFmt w:val="decimal"/>
@@ -7255,40 +7255,40 @@
       </w:pPr>
     </w:lvl>
   </w:abstractNum>
-  <w:num w:numId="1" w16cid:durableId="1868788965">
+  <w:num w:numId="1" w16cid:durableId="546720076">
     <w:abstractNumId w:val="8"/>
   </w:num>
-  <w:num w:numId="2" w16cid:durableId="498933466">
+  <w:num w:numId="2" w16cid:durableId="1439567536">
     <w:abstractNumId w:val="6"/>
   </w:num>
-  <w:num w:numId="3" w16cid:durableId="369653459">
+  <w:num w:numId="3" w16cid:durableId="1404644713">
     <w:abstractNumId w:val="5"/>
   </w:num>
-  <w:num w:numId="4" w16cid:durableId="1104350474">
+  <w:num w:numId="4" w16cid:durableId="276761827">
     <w:abstractNumId w:val="4"/>
   </w:num>
-  <w:num w:numId="5" w16cid:durableId="295376050">
+  <w:num w:numId="5" w16cid:durableId="1299916252">
     <w:abstractNumId w:val="7"/>
   </w:num>
-  <w:num w:numId="6" w16cid:durableId="713240824">
+  <w:num w:numId="6" w16cid:durableId="899563412">
     <w:abstractNumId w:val="3"/>
   </w:num>
-  <w:num w:numId="7" w16cid:durableId="510536727">
+  <w:num w:numId="7" w16cid:durableId="1891917411">
     <w:abstractNumId w:val="2"/>
   </w:num>
-  <w:num w:numId="8" w16cid:durableId="1898661172">
+  <w:num w:numId="8" w16cid:durableId="1098645981">
     <w:abstractNumId w:val="1"/>
   </w:num>
-  <w:num w:numId="9" w16cid:durableId="889078792">
+  <w:num w:numId="9" w16cid:durableId="11957121">
     <w:abstractNumId w:val="0"/>
   </w:num>
-  <w:num w:numId="10" w16cid:durableId="1407916670">
+  <w:num w:numId="10" w16cid:durableId="985477881">
     <w:abstractNumId w:val="9"/>
   </w:num>
-  <w:num w:numId="11" w16cid:durableId="757403438">
+  <w:num w:numId="11" w16cid:durableId="1644461449">
     <w:abstractNumId w:val="10"/>
   </w:num>
-  <w:num w:numId="12" w16cid:durableId="1829783535">
+  <w:num w:numId="12" w16cid:durableId="337736329">
     <w:abstractNumId w:val="11"/>
     <w:lvlOverride w:ilvl="0">
       <w:startOverride w:val="1"/>
@@ -7318,7 +7318,7 @@
       <w:startOverride w:val="1"/>
     </w:lvlOverride>
   </w:num>
-  <w:num w:numId="13" w16cid:durableId="518661608">
+  <w:num w:numId="13" w16cid:durableId="1274172016">
     <w:abstractNumId w:val="12"/>
     <w:lvlOverride w:ilvl="0">
       <w:startOverride w:val="3"/>
@@ -7348,31 +7348,31 @@
       <w:startOverride w:val="3"/>
     </w:lvlOverride>
   </w:num>
-  <w:num w:numId="14" w16cid:durableId="1363628499">
+  <w:num w:numId="14" w16cid:durableId="1469283347">
     <w:abstractNumId w:val="10"/>
   </w:num>
-  <w:num w:numId="15" w16cid:durableId="21244387">
+  <w:num w:numId="15" w16cid:durableId="656883279">
     <w:abstractNumId w:val="10"/>
   </w:num>
-  <w:num w:numId="16" w16cid:durableId="1753382841">
+  <w:num w:numId="16" w16cid:durableId="417946347">
     <w:abstractNumId w:val="10"/>
   </w:num>
-  <w:num w:numId="17" w16cid:durableId="2131364168">
+  <w:num w:numId="17" w16cid:durableId="1446927428">
     <w:abstractNumId w:val="10"/>
   </w:num>
-  <w:num w:numId="18" w16cid:durableId="677347088">
+  <w:num w:numId="18" w16cid:durableId="504439253">
     <w:abstractNumId w:val="10"/>
   </w:num>
-  <w:num w:numId="19" w16cid:durableId="1358312716">
+  <w:num w:numId="19" w16cid:durableId="1895658419">
     <w:abstractNumId w:val="10"/>
   </w:num>
-  <w:num w:numId="20" w16cid:durableId="593367204">
+  <w:num w:numId="20" w16cid:durableId="297029376">
     <w:abstractNumId w:val="10"/>
   </w:num>
-  <w:num w:numId="21" w16cid:durableId="71437989">
+  <w:num w:numId="21" w16cid:durableId="1989822240">
     <w:abstractNumId w:val="10"/>
   </w:num>
-  <w:num w:numId="22" w16cid:durableId="130488204">
+  <w:num w:numId="22" w16cid:durableId="1172376165">
     <w:abstractNumId w:val="11"/>
     <w:lvlOverride w:ilvl="0">
       <w:startOverride w:val="1"/>
@@ -7402,19 +7402,19 @@
       <w:startOverride w:val="1"/>
     </w:lvlOverride>
   </w:num>
-  <w:num w:numId="23" w16cid:durableId="1757634944">
+  <w:num w:numId="23" w16cid:durableId="1680809413">
     <w:abstractNumId w:val="10"/>
   </w:num>
-  <w:num w:numId="24" w16cid:durableId="1603954191">
+  <w:num w:numId="24" w16cid:durableId="130749479">
     <w:abstractNumId w:val="10"/>
   </w:num>
-  <w:num w:numId="25" w16cid:durableId="1709333072">
+  <w:num w:numId="25" w16cid:durableId="1100489725">
     <w:abstractNumId w:val="10"/>
   </w:num>
-  <w:num w:numId="26" w16cid:durableId="296647131">
+  <w:num w:numId="26" w16cid:durableId="544951229">
     <w:abstractNumId w:val="10"/>
   </w:num>
-  <w:num w:numId="27" w16cid:durableId="1091387738">
+  <w:num w:numId="27" w16cid:durableId="1145321392">
     <w:abstractNumId w:val="10"/>
   </w:num>
 </w:numbering>
@@ -19235,7 +19235,7 @@
     <w:autoRedefine/>
     <w:uiPriority w:val="39"/>
     <w:unhideWhenUsed/>
-    <w:rsid w:val="00012B04"/>
+    <w:rsid w:val="004D6D3C"/>
     <w:pPr>
       <w:spacing w:after="100"/>
     </w:pPr>
@@ -19247,7 +19247,7 @@
     <w:autoRedefine/>
     <w:uiPriority w:val="39"/>
     <w:unhideWhenUsed/>
-    <w:rsid w:val="00012B04"/>
+    <w:rsid w:val="004D6D3C"/>
     <w:pPr>
       <w:spacing w:after="100"/>
       <w:ind w:left="220"/>
@@ -19258,7 +19258,7 @@
     <w:basedOn w:val="DefaultParagraphFont"/>
     <w:uiPriority w:val="99"/>
     <w:unhideWhenUsed/>
-    <w:rsid w:val="00012B04"/>
+    <w:rsid w:val="004D6D3C"/>
     <w:rPr>
       <w:color w:val="0000FF" w:themeColor="hyperlink"/>
       <w:u w:val="single"/>

</xml_diff>

<commit_message>
Introduce VDCLOUD_USER, improve env setup instructions, refresh guides
- Add VDCLOUD_USER to bigdata-env.sh template; replace $USER with
  $VDCLOUD_USER in all hdfs/kubectl/spark-submit commands across
  docs/04, docs/05, docs/06, README.md and README.en.md — fixes
  the mismatch between WSL Linux username and vdcloud account name
- Rewrite docs/04 section 2: replace manual .profile/.bashrc nano
  editing with two simple echo-append commands and a brief
  explanation of login vs interactive shells
- Add bold run-once warning with repair instructions for both files
- Regenerate all DOCX guides

Co-Authored-By: Claude Sonnet 4.6 <noreply@anthropic.com>
</commit_message>
<xml_diff>
--- a/odigoi/01_workstation_setup.docx
+++ b/odigoi/01_workstation_setup.docx
@@ -20,7 +20,7 @@
           <w:sz w:val="22"/>
           <w:szCs w:val="22"/>
         </w:rPr>
-        <w:id w:val="-2024159483"/>
+        <w:id w:val="-36431449"/>
         <w:docPartObj>
           <w:docPartGallery w:val="Table of Contents"/>
           <w:docPartUnique/>
@@ -61,7 +61,7 @@
           <w:r>
             <w:fldChar w:fldCharType="separate"/>
           </w:r>
-          <w:hyperlink w:anchor="_Toc225777253" w:history="1">
+          <w:hyperlink w:anchor="_Toc227785053" w:history="1">
             <w:r>
               <w:rPr>
                 <w:rStyle w:val="Hyperlink"/>
@@ -88,7 +88,7 @@
                 <w:noProof/>
                 <w:webHidden/>
               </w:rPr>
-              <w:instrText xml:space="preserve"> PAGEREF _Toc225777253 \h </w:instrText>
+              <w:instrText xml:space="preserve"> PAGEREF _Toc227785053 \h </w:instrText>
             </w:r>
             <w:r>
               <w:rPr>
@@ -135,7 +135,7 @@
               <w14:ligatures w14:val="standardContextual"/>
             </w:rPr>
           </w:pPr>
-          <w:hyperlink w:anchor="_Toc225777254" w:history="1">
+          <w:hyperlink w:anchor="_Toc227785054" w:history="1">
             <w:r>
               <w:rPr>
                 <w:rStyle w:val="Hyperlink"/>
@@ -162,7 +162,7 @@
                 <w:noProof/>
                 <w:webHidden/>
               </w:rPr>
-              <w:instrText xml:space="preserve"> PAGEREF _Toc225777254 \h </w:instrText>
+              <w:instrText xml:space="preserve"> PAGEREF _Toc227785054 \h </w:instrText>
             </w:r>
             <w:r>
               <w:rPr>
@@ -209,7 +209,7 @@
               <w14:ligatures w14:val="standardContextual"/>
             </w:rPr>
           </w:pPr>
-          <w:hyperlink w:anchor="_Toc225777255" w:history="1">
+          <w:hyperlink w:anchor="_Toc227785055" w:history="1">
             <w:r>
               <w:rPr>
                 <w:rStyle w:val="Hyperlink"/>
@@ -236,7 +236,7 @@
                 <w:noProof/>
                 <w:webHidden/>
               </w:rPr>
-              <w:instrText xml:space="preserve"> PAGEREF _Toc225777255 \h </w:instrText>
+              <w:instrText xml:space="preserve"> PAGEREF _Toc227785055 \h </w:instrText>
             </w:r>
             <w:r>
               <w:rPr>
@@ -283,7 +283,7 @@
               <w14:ligatures w14:val="standardContextual"/>
             </w:rPr>
           </w:pPr>
-          <w:hyperlink w:anchor="_Toc225777256" w:history="1">
+          <w:hyperlink w:anchor="_Toc227785056" w:history="1">
             <w:r>
               <w:rPr>
                 <w:rStyle w:val="Hyperlink"/>
@@ -310,7 +310,7 @@
                 <w:noProof/>
                 <w:webHidden/>
               </w:rPr>
-              <w:instrText xml:space="preserve"> PAGEREF _Toc225777256 \h </w:instrText>
+              <w:instrText xml:space="preserve"> PAGEREF _Toc227785056 \h </w:instrText>
             </w:r>
             <w:r>
               <w:rPr>
@@ -357,7 +357,7 @@
               <w14:ligatures w14:val="standardContextual"/>
             </w:rPr>
           </w:pPr>
-          <w:hyperlink w:anchor="_Toc225777257" w:history="1">
+          <w:hyperlink w:anchor="_Toc227785057" w:history="1">
             <w:r>
               <w:rPr>
                 <w:rStyle w:val="Hyperlink"/>
@@ -384,7 +384,7 @@
                 <w:noProof/>
                 <w:webHidden/>
               </w:rPr>
-              <w:instrText xml:space="preserve"> PAGEREF _Toc225777257 \h </w:instrText>
+              <w:instrText xml:space="preserve"> PAGEREF _Toc227785057 \h </w:instrText>
             </w:r>
             <w:r>
               <w:rPr>
@@ -431,7 +431,7 @@
               <w14:ligatures w14:val="standardContextual"/>
             </w:rPr>
           </w:pPr>
-          <w:hyperlink w:anchor="_Toc225777258" w:history="1">
+          <w:hyperlink w:anchor="_Toc227785058" w:history="1">
             <w:r>
               <w:rPr>
                 <w:rStyle w:val="Hyperlink"/>
@@ -458,7 +458,7 @@
                 <w:noProof/>
                 <w:webHidden/>
               </w:rPr>
-              <w:instrText xml:space="preserve"> PAGEREF _Toc225777258 \h </w:instrText>
+              <w:instrText xml:space="preserve"> PAGEREF _Toc227785058 \h </w:instrText>
             </w:r>
             <w:r>
               <w:rPr>
@@ -505,7 +505,7 @@
               <w14:ligatures w14:val="standardContextual"/>
             </w:rPr>
           </w:pPr>
-          <w:hyperlink w:anchor="_Toc225777259" w:history="1">
+          <w:hyperlink w:anchor="_Toc227785059" w:history="1">
             <w:r>
               <w:rPr>
                 <w:rStyle w:val="Hyperlink"/>
@@ -532,7 +532,7 @@
                 <w:noProof/>
                 <w:webHidden/>
               </w:rPr>
-              <w:instrText xml:space="preserve"> PAGEREF _Toc225777259 \h </w:instrText>
+              <w:instrText xml:space="preserve"> PAGEREF _Toc227785059 \h </w:instrText>
             </w:r>
             <w:r>
               <w:rPr>
@@ -579,7 +579,7 @@
               <w14:ligatures w14:val="standardContextual"/>
             </w:rPr>
           </w:pPr>
-          <w:hyperlink w:anchor="_Toc225777260" w:history="1">
+          <w:hyperlink w:anchor="_Toc227785060" w:history="1">
             <w:r>
               <w:rPr>
                 <w:rStyle w:val="Hyperlink"/>
@@ -606,7 +606,7 @@
                 <w:noProof/>
                 <w:webHidden/>
               </w:rPr>
-              <w:instrText xml:space="preserve"> PAGEREF _Toc225777260 \h </w:instrText>
+              <w:instrText xml:space="preserve"> PAGEREF _Toc227785060 \h </w:instrText>
             </w:r>
             <w:r>
               <w:rPr>
@@ -653,7 +653,7 @@
               <w14:ligatures w14:val="standardContextual"/>
             </w:rPr>
           </w:pPr>
-          <w:hyperlink w:anchor="_Toc225777261" w:history="1">
+          <w:hyperlink w:anchor="_Toc227785061" w:history="1">
             <w:r>
               <w:rPr>
                 <w:rStyle w:val="Hyperlink"/>
@@ -680,7 +680,7 @@
                 <w:noProof/>
                 <w:webHidden/>
               </w:rPr>
-              <w:instrText xml:space="preserve"> PAGEREF _Toc225777261 \h </w:instrText>
+              <w:instrText xml:space="preserve"> PAGEREF _Toc227785061 \h </w:instrText>
             </w:r>
             <w:r>
               <w:rPr>
@@ -727,7 +727,7 @@
               <w14:ligatures w14:val="standardContextual"/>
             </w:rPr>
           </w:pPr>
-          <w:hyperlink w:anchor="_Toc225777262" w:history="1">
+          <w:hyperlink w:anchor="_Toc227785062" w:history="1">
             <w:r>
               <w:rPr>
                 <w:rStyle w:val="Hyperlink"/>
@@ -754,7 +754,7 @@
                 <w:noProof/>
                 <w:webHidden/>
               </w:rPr>
-              <w:instrText xml:space="preserve"> PAGEREF _Toc225777262 \h </w:instrText>
+              <w:instrText xml:space="preserve"> PAGEREF _Toc227785062 \h </w:instrText>
             </w:r>
             <w:r>
               <w:rPr>
@@ -801,7 +801,7 @@
               <w14:ligatures w14:val="standardContextual"/>
             </w:rPr>
           </w:pPr>
-          <w:hyperlink w:anchor="_Toc225777263" w:history="1">
+          <w:hyperlink w:anchor="_Toc227785063" w:history="1">
             <w:r>
               <w:rPr>
                 <w:rStyle w:val="Hyperlink"/>
@@ -828,7 +828,7 @@
                 <w:noProof/>
                 <w:webHidden/>
               </w:rPr>
-              <w:instrText xml:space="preserve"> PAGEREF _Toc225777263 \h </w:instrText>
+              <w:instrText xml:space="preserve"> PAGEREF _Toc227785063 \h </w:instrText>
             </w:r>
             <w:r>
               <w:rPr>
@@ -875,7 +875,7 @@
               <w14:ligatures w14:val="standardContextual"/>
             </w:rPr>
           </w:pPr>
-          <w:hyperlink w:anchor="_Toc225777264" w:history="1">
+          <w:hyperlink w:anchor="_Toc227785064" w:history="1">
             <w:r>
               <w:rPr>
                 <w:rStyle w:val="Hyperlink"/>
@@ -911,7 +911,7 @@
                 <w:noProof/>
                 <w:webHidden/>
               </w:rPr>
-              <w:instrText xml:space="preserve"> PAGEREF _Toc225777264 \h </w:instrText>
+              <w:instrText xml:space="preserve"> PAGEREF _Toc227785064 \h </w:instrText>
             </w:r>
             <w:r>
               <w:rPr>
@@ -958,7 +958,7 @@
               <w14:ligatures w14:val="standardContextual"/>
             </w:rPr>
           </w:pPr>
-          <w:hyperlink w:anchor="_Toc225777265" w:history="1">
+          <w:hyperlink w:anchor="_Toc227785065" w:history="1">
             <w:r>
               <w:rPr>
                 <w:rStyle w:val="Hyperlink"/>
@@ -985,7 +985,7 @@
                 <w:noProof/>
                 <w:webHidden/>
               </w:rPr>
-              <w:instrText xml:space="preserve"> PAGEREF _Toc225777265 \h </w:instrText>
+              <w:instrText xml:space="preserve"> PAGEREF _Toc227785065 \h </w:instrText>
             </w:r>
             <w:r>
               <w:rPr>
@@ -1032,7 +1032,7 @@
               <w14:ligatures w14:val="standardContextual"/>
             </w:rPr>
           </w:pPr>
-          <w:hyperlink w:anchor="_Toc225777266" w:history="1">
+          <w:hyperlink w:anchor="_Toc227785066" w:history="1">
             <w:r>
               <w:rPr>
                 <w:rStyle w:val="Hyperlink"/>
@@ -1059,7 +1059,7 @@
                 <w:noProof/>
                 <w:webHidden/>
               </w:rPr>
-              <w:instrText xml:space="preserve"> PAGEREF _Toc225777266 \h </w:instrText>
+              <w:instrText xml:space="preserve"> PAGEREF _Toc227785066 \h </w:instrText>
             </w:r>
             <w:r>
               <w:rPr>
@@ -1106,7 +1106,7 @@
               <w14:ligatures w14:val="standardContextual"/>
             </w:rPr>
           </w:pPr>
-          <w:hyperlink w:anchor="_Toc225777267" w:history="1">
+          <w:hyperlink w:anchor="_Toc227785067" w:history="1">
             <w:r>
               <w:rPr>
                 <w:rStyle w:val="Hyperlink"/>
@@ -1133,7 +1133,7 @@
                 <w:noProof/>
                 <w:webHidden/>
               </w:rPr>
-              <w:instrText xml:space="preserve"> PAGEREF _Toc225777267 \h </w:instrText>
+              <w:instrText xml:space="preserve"> PAGEREF _Toc227785067 \h </w:instrText>
             </w:r>
             <w:r>
               <w:rPr>
@@ -1180,7 +1180,7 @@
               <w14:ligatures w14:val="standardContextual"/>
             </w:rPr>
           </w:pPr>
-          <w:hyperlink w:anchor="_Toc225777268" w:history="1">
+          <w:hyperlink w:anchor="_Toc227785068" w:history="1">
             <w:r>
               <w:rPr>
                 <w:rStyle w:val="Hyperlink"/>
@@ -1207,7 +1207,7 @@
                 <w:noProof/>
                 <w:webHidden/>
               </w:rPr>
-              <w:instrText xml:space="preserve"> PAGEREF _Toc225777268 \h </w:instrText>
+              <w:instrText xml:space="preserve"> PAGEREF _Toc227785068 \h </w:instrText>
             </w:r>
             <w:r>
               <w:rPr>
@@ -1255,7 +1255,7 @@
         <w:pStyle w:val="Heading1"/>
       </w:pPr>
       <w:bookmarkStart w:id="0" w:name="X4dd9fbe08777ef1289ff22573c7e3f439118723"/>
-      <w:bookmarkStart w:id="1" w:name="_Toc225777253"/>
+      <w:bookmarkStart w:id="1" w:name="_Toc227785053"/>
       <w:r>
         <w:t>Ενεργοποίηση WSL και Virtual Machine Platform</w:t>
       </w:r>
@@ -1310,7 +1310,7 @@
         </w:rPr>
         <w:lastRenderedPageBreak/>
         <w:drawing>
-          <wp:inline distT="0" distB="0" distL="0" distR="0" wp14:anchorId="3526A684" wp14:editId="26CEE634">
+          <wp:inline distT="0" distB="0" distL="0" distR="0" wp14:anchorId="19ADE7EA" wp14:editId="3FA6C4FD">
             <wp:extent cx="4398745" cy="6429675"/>
             <wp:effectExtent l="0" t="0" r="0" b="0"/>
             <wp:docPr id="22" name="Picture" descr="Εικόνα 1"/>
@@ -1441,7 +1441,7 @@
         </w:rPr>
         <w:lastRenderedPageBreak/>
         <w:drawing>
-          <wp:inline distT="0" distB="0" distL="0" distR="0" wp14:anchorId="6A6220F8" wp14:editId="5197C041">
+          <wp:inline distT="0" distB="0" distL="0" distR="0" wp14:anchorId="7BDFF499" wp14:editId="59B797DA">
             <wp:extent cx="6692900" cy="3783205"/>
             <wp:effectExtent l="0" t="0" r="0" b="0"/>
             <wp:docPr id="25" name="Picture" descr="Εικόνα 2"/>
@@ -1492,7 +1492,7 @@
           <w:noProof/>
         </w:rPr>
         <w:drawing>
-          <wp:inline distT="0" distB="0" distL="0" distR="0" wp14:anchorId="45B7689C" wp14:editId="28351133">
+          <wp:inline distT="0" distB="0" distL="0" distR="0" wp14:anchorId="73497337" wp14:editId="63D5E9D5">
             <wp:extent cx="6692900" cy="912378"/>
             <wp:effectExtent l="0" t="0" r="0" b="0"/>
             <wp:docPr id="28" name="Picture" descr="Εικόνα 2"/>
@@ -1588,7 +1588,7 @@
         <w:pStyle w:val="Heading2"/>
       </w:pPr>
       <w:bookmarkStart w:id="2" w:name="X16ac49483153b83d03411f3fca6b9347554c86b"/>
-      <w:bookmarkStart w:id="3" w:name="_Toc225777254"/>
+      <w:bookmarkStart w:id="3" w:name="_Toc227785054"/>
       <w:r>
         <w:t>Προαιρετική σημείωση για όσους δοκιμάζουν τον οδηγό μέσα σε Hyper-V VM</w:t>
       </w:r>
@@ -1951,7 +1951,7 @@
         <w:pStyle w:val="Heading1"/>
       </w:pPr>
       <w:bookmarkStart w:id="4" w:name="ρύθμιση-του-ubuntu"/>
-      <w:bookmarkStart w:id="5" w:name="_Toc225777255"/>
+      <w:bookmarkStart w:id="5" w:name="_Toc227785055"/>
       <w:bookmarkEnd w:id="0"/>
       <w:bookmarkEnd w:id="2"/>
       <w:r>
@@ -1987,7 +1987,7 @@
           <w:noProof/>
         </w:rPr>
         <w:drawing>
-          <wp:inline distT="0" distB="0" distL="0" distR="0" wp14:anchorId="16E193EB" wp14:editId="66F44F4C">
+          <wp:inline distT="0" distB="0" distL="0" distR="0" wp14:anchorId="20787D1A" wp14:editId="4964176D">
             <wp:extent cx="6063915" cy="4032985"/>
             <wp:effectExtent l="0" t="0" r="0" b="0"/>
             <wp:docPr id="33" name="Picture" descr="Εικόνα 4"/>
@@ -2054,7 +2054,7 @@
         </w:rPr>
         <w:lastRenderedPageBreak/>
         <w:drawing>
-          <wp:inline distT="0" distB="0" distL="0" distR="0" wp14:anchorId="459307E7" wp14:editId="34A2F4F9">
+          <wp:inline distT="0" distB="0" distL="0" distR="0" wp14:anchorId="1FE3874B" wp14:editId="76CA01CA">
             <wp:extent cx="6692900" cy="834345"/>
             <wp:effectExtent l="0" t="0" r="0" b="0"/>
             <wp:docPr id="36" name="Picture" descr="Εικόνα 7"/>
@@ -2101,7 +2101,7 @@
         <w:pStyle w:val="Heading1"/>
       </w:pPr>
       <w:bookmarkStart w:id="6" w:name="αναβάθμιση-και-ενημερώσεις"/>
-      <w:bookmarkStart w:id="7" w:name="_Toc225777256"/>
+      <w:bookmarkStart w:id="7" w:name="_Toc227785056"/>
       <w:bookmarkEnd w:id="4"/>
       <w:r>
         <w:t>Αναβάθμιση και ενημερώσεις</w:t>
@@ -2233,7 +2233,7 @@
           <w:noProof/>
         </w:rPr>
         <w:drawing>
-          <wp:inline distT="0" distB="0" distL="0" distR="0" wp14:anchorId="6A9CB5F1" wp14:editId="18FCD551">
+          <wp:inline distT="0" distB="0" distL="0" distR="0" wp14:anchorId="3EB38F67" wp14:editId="0991475A">
             <wp:extent cx="4321743" cy="750770"/>
             <wp:effectExtent l="0" t="0" r="0" b="0"/>
             <wp:docPr id="40" name="Picture" descr="Εικόνα 2"/>
@@ -2477,7 +2477,7 @@
         <w:pStyle w:val="Heading1"/>
       </w:pPr>
       <w:bookmarkStart w:id="8" w:name="εγκατάσταση-docker-στο-wsl"/>
-      <w:bookmarkStart w:id="9" w:name="_Toc225777257"/>
+      <w:bookmarkStart w:id="9" w:name="_Toc227785057"/>
       <w:bookmarkEnd w:id="6"/>
       <w:r>
         <w:t>Εγκατάσταση Docker στο WSL</w:t>
@@ -2562,7 +2562,7 @@
         <w:pStyle w:val="Heading2"/>
       </w:pPr>
       <w:bookmarkStart w:id="10" w:name="προτεινόμενη-διαδρομή-docker-desktop"/>
-      <w:bookmarkStart w:id="11" w:name="_Toc225777258"/>
+      <w:bookmarkStart w:id="11" w:name="_Toc227785058"/>
       <w:r>
         <w:lastRenderedPageBreak/>
         <w:t>Προτεινόμενη διαδρομή: Docker Desktop</w:t>
@@ -2608,7 +2608,7 @@
           <w:noProof/>
         </w:rPr>
         <w:drawing>
-          <wp:inline distT="0" distB="0" distL="0" distR="0" wp14:anchorId="36903415" wp14:editId="552AD12F">
+          <wp:inline distT="0" distB="0" distL="0" distR="0" wp14:anchorId="256AEE83" wp14:editId="124CCE84">
             <wp:extent cx="6692900" cy="4471964"/>
             <wp:effectExtent l="0" t="0" r="0" b="0"/>
             <wp:docPr id="45" name="Picture" descr="Εικόνα 18"/>
@@ -2692,7 +2692,7 @@
           <w:noProof/>
         </w:rPr>
         <w:drawing>
-          <wp:inline distT="0" distB="0" distL="0" distR="0" wp14:anchorId="66A7E3D2" wp14:editId="51DBD0C5">
+          <wp:inline distT="0" distB="0" distL="0" distR="0" wp14:anchorId="279B56E7" wp14:editId="0D619132">
             <wp:extent cx="6692900" cy="1599019"/>
             <wp:effectExtent l="0" t="0" r="0" b="0"/>
             <wp:docPr id="48" name="Picture" descr="Εικόνα 11"/>
@@ -2787,7 +2787,7 @@
           <w:noProof/>
         </w:rPr>
         <w:drawing>
-          <wp:inline distT="0" distB="0" distL="0" distR="0" wp14:anchorId="78E4FB77" wp14:editId="039005A3">
+          <wp:inline distT="0" distB="0" distL="0" distR="0" wp14:anchorId="730BE442" wp14:editId="2A40A18D">
             <wp:extent cx="6692900" cy="4615132"/>
             <wp:effectExtent l="0" t="0" r="0" b="0"/>
             <wp:docPr id="51" name="Picture" descr="Εικόνα 8"/>
@@ -2846,7 +2846,7 @@
           <w:noProof/>
         </w:rPr>
         <w:drawing>
-          <wp:inline distT="0" distB="0" distL="0" distR="0" wp14:anchorId="4734E600" wp14:editId="53687926">
+          <wp:inline distT="0" distB="0" distL="0" distR="0" wp14:anchorId="0C827585" wp14:editId="03E313E3">
             <wp:extent cx="6692900" cy="2919863"/>
             <wp:effectExtent l="0" t="0" r="0" b="0"/>
             <wp:docPr id="54" name="Picture" descr="Εικόνα 3"/>
@@ -2989,7 +2989,7 @@
           <w:noProof/>
         </w:rPr>
         <w:drawing>
-          <wp:inline distT="0" distB="0" distL="0" distR="0" wp14:anchorId="69FC76E7" wp14:editId="156A5C6E">
+          <wp:inline distT="0" distB="0" distL="0" distR="0" wp14:anchorId="397E9128" wp14:editId="47936D05">
             <wp:extent cx="6692900" cy="3622664"/>
             <wp:effectExtent l="0" t="0" r="0" b="0"/>
             <wp:docPr id="57" name="Picture" descr="Εικόνα 21"/>
@@ -3066,7 +3066,7 @@
         </w:rPr>
         <w:lastRenderedPageBreak/>
         <w:drawing>
-          <wp:inline distT="0" distB="0" distL="0" distR="0" wp14:anchorId="2C6899A4" wp14:editId="43DAEC77">
+          <wp:inline distT="0" distB="0" distL="0" distR="0" wp14:anchorId="7DCA2936" wp14:editId="4F9BF8FF">
             <wp:extent cx="6692900" cy="4142408"/>
             <wp:effectExtent l="0" t="0" r="0" b="0"/>
             <wp:docPr id="60" name="Picture" descr="Εικόνα 12"/>
@@ -3192,7 +3192,7 @@
           <w:noProof/>
         </w:rPr>
         <w:drawing>
-          <wp:inline distT="0" distB="0" distL="0" distR="0" wp14:anchorId="40AE5A70" wp14:editId="7BD03FEB">
+          <wp:inline distT="0" distB="0" distL="0" distR="0" wp14:anchorId="2DAC3C8F" wp14:editId="439BFF55">
             <wp:extent cx="4918509" cy="952901"/>
             <wp:effectExtent l="0" t="0" r="0" b="0"/>
             <wp:docPr id="63" name="Picture" descr="Εικόνα 5"/>
@@ -3277,7 +3277,7 @@
           <w:noProof/>
         </w:rPr>
         <w:drawing>
-          <wp:inline distT="0" distB="0" distL="0" distR="0" wp14:anchorId="7F311447" wp14:editId="18E3D604">
+          <wp:inline distT="0" distB="0" distL="0" distR="0" wp14:anchorId="529F415C" wp14:editId="429B4C53">
             <wp:extent cx="6692900" cy="4431561"/>
             <wp:effectExtent l="0" t="0" r="0" b="0"/>
             <wp:docPr id="66" name="Picture" descr="Εικόνα 25"/>
@@ -3399,7 +3399,7 @@
         <w:pStyle w:val="Heading2"/>
       </w:pPr>
       <w:bookmarkStart w:id="12" w:name="X652a91baeda68442877bd0e6806f00b30d9ee40"/>
-      <w:bookmarkStart w:id="13" w:name="_Toc225777259"/>
+      <w:bookmarkStart w:id="13" w:name="_Toc227785059"/>
       <w:bookmarkEnd w:id="10"/>
       <w:r>
         <w:t>Προαιρετική advanced εναλλακτική: native Docker Engine μέσα στο WSL</w:t>
@@ -4170,7 +4170,7 @@
         <w:pStyle w:val="Heading1"/>
       </w:pPr>
       <w:bookmarkStart w:id="14" w:name="Xb171393346700e54c36c8065d381c8c50c67c8e"/>
-      <w:bookmarkStart w:id="15" w:name="_Toc225777260"/>
+      <w:bookmarkStart w:id="15" w:name="_Toc227785060"/>
       <w:bookmarkEnd w:id="8"/>
       <w:bookmarkEnd w:id="12"/>
       <w:r>
@@ -4296,7 +4296,7 @@
         <w:pStyle w:val="Heading2"/>
       </w:pPr>
       <w:bookmarkStart w:id="16" w:name="για-τη-διαδρομή-windows--powershell"/>
-      <w:bookmarkStart w:id="17" w:name="_Toc225777261"/>
+      <w:bookmarkStart w:id="17" w:name="_Toc227785061"/>
       <w:r>
         <w:t>Για τη διαδρομή Windows / PowerShell</w:t>
       </w:r>
@@ -4841,7 +4841,7 @@
         <w:pStyle w:val="Heading2"/>
       </w:pPr>
       <w:bookmarkStart w:id="18" w:name="X164c7c7c213ce33dfb5608473e7de326f8f0284"/>
-      <w:bookmarkStart w:id="19" w:name="_Toc225777262"/>
+      <w:bookmarkStart w:id="19" w:name="_Toc227785062"/>
       <w:bookmarkEnd w:id="16"/>
       <w:r>
         <w:t>OpenVPN client στα Windows και αρχεία πρόσβασης του εργαστηρίου</w:t>
@@ -5010,7 +5010,7 @@
         <w:pStyle w:val="Heading2"/>
       </w:pPr>
       <w:bookmarkStart w:id="20" w:name="για-τη-διαδρομή-wsl--ubuntu"/>
-      <w:bookmarkStart w:id="21" w:name="_Toc225777263"/>
+      <w:bookmarkStart w:id="21" w:name="_Toc227785063"/>
       <w:bookmarkEnd w:id="18"/>
       <w:r>
         <w:t>Για τη διαδρομή WSL / Ubuntu</w:t>
@@ -5678,7 +5678,7 @@
         <w:pStyle w:val="Heading1"/>
       </w:pPr>
       <w:bookmarkStart w:id="22" w:name="Xe261258f9b378c2bf9cf1ed2d29933bf3df61b3"/>
-      <w:bookmarkStart w:id="23" w:name="_Toc225777264"/>
+      <w:bookmarkStart w:id="23" w:name="_Toc227785064"/>
       <w:bookmarkEnd w:id="14"/>
       <w:bookmarkEnd w:id="20"/>
       <w:r>
@@ -6093,7 +6093,7 @@
         <w:pStyle w:val="Heading1"/>
       </w:pPr>
       <w:bookmarkStart w:id="24" w:name="επόμενο-βήμα-λήψη-του-repository"/>
-      <w:bookmarkStart w:id="25" w:name="_Toc225777265"/>
+      <w:bookmarkStart w:id="25" w:name="_Toc227785065"/>
       <w:bookmarkEnd w:id="22"/>
       <w:r>
         <w:lastRenderedPageBreak/>
@@ -6156,7 +6156,7 @@
         <w:pStyle w:val="Heading2"/>
       </w:pPr>
       <w:bookmarkStart w:id="26" w:name="επιλογή-α-clone-σε-φάκελο-των-windows"/>
-      <w:bookmarkStart w:id="27" w:name="_Toc225777266"/>
+      <w:bookmarkStart w:id="27" w:name="_Toc227785066"/>
       <w:r>
         <w:t>Επιλογή Α: clone σε φάκελο των Windows</w:t>
       </w:r>
@@ -6302,7 +6302,7 @@
         <w:pStyle w:val="Heading2"/>
       </w:pPr>
       <w:bookmarkStart w:id="28" w:name="επιλογή-β-clone-μέσα-στο-wsl"/>
-      <w:bookmarkStart w:id="29" w:name="_Toc225777267"/>
+      <w:bookmarkStart w:id="29" w:name="_Toc227785067"/>
       <w:bookmarkEnd w:id="26"/>
       <w:r>
         <w:t>Επιλογή Β: clone μέσα στο WSL</w:t>
@@ -6398,7 +6398,7 @@
         <w:pStyle w:val="Heading2"/>
       </w:pPr>
       <w:bookmarkStart w:id="30" w:name="τι-να-κρατήσετε"/>
-      <w:bookmarkStart w:id="31" w:name="_Toc225777268"/>
+      <w:bookmarkStart w:id="31" w:name="_Toc227785068"/>
       <w:bookmarkEnd w:id="28"/>
       <w:r>
         <w:t>Τι να κρατήσετε</w:t>
@@ -6905,7 +6905,7 @@
   <w:abstractNum w:abstractNumId="9" w15:restartNumberingAfterBreak="0">
     <w:nsid w:val="0000A990"/>
     <w:multiLevelType w:val="multilevel"/>
-    <w:tmpl w:val="43068CAA"/>
+    <w:tmpl w:val="FC56173E"/>
     <w:lvl w:ilvl="0">
       <w:numFmt w:val="bullet"/>
       <w:lvlText w:val=" "/>
@@ -6982,7 +6982,7 @@
   <w:abstractNum w:abstractNumId="10" w15:restartNumberingAfterBreak="0">
     <w:nsid w:val="0000A991"/>
     <w:multiLevelType w:val="multilevel"/>
-    <w:tmpl w:val="D7F4505E"/>
+    <w:tmpl w:val="982069E2"/>
     <w:lvl w:ilvl="0">
       <w:numFmt w:val="bullet"/>
       <w:lvlText w:val=""/>
@@ -7086,7 +7086,7 @@
   <w:abstractNum w:abstractNumId="11" w15:restartNumberingAfterBreak="0">
     <w:nsid w:val="00A99411"/>
     <w:multiLevelType w:val="multilevel"/>
-    <w:tmpl w:val="C1AA0A14"/>
+    <w:tmpl w:val="F55EC38C"/>
     <w:lvl w:ilvl="0">
       <w:start w:val="1"/>
       <w:numFmt w:val="decimal"/>
@@ -7172,7 +7172,7 @@
   <w:abstractNum w:abstractNumId="12" w15:restartNumberingAfterBreak="0">
     <w:nsid w:val="00A99413"/>
     <w:multiLevelType w:val="multilevel"/>
-    <w:tmpl w:val="DDEE80A2"/>
+    <w:tmpl w:val="68EC9944"/>
     <w:lvl w:ilvl="0">
       <w:start w:val="3"/>
       <w:numFmt w:val="decimal"/>
@@ -7255,40 +7255,40 @@
       </w:pPr>
     </w:lvl>
   </w:abstractNum>
-  <w:num w:numId="1" w16cid:durableId="546720076">
+  <w:num w:numId="1" w16cid:durableId="1566379115">
     <w:abstractNumId w:val="8"/>
   </w:num>
-  <w:num w:numId="2" w16cid:durableId="1439567536">
+  <w:num w:numId="2" w16cid:durableId="1508473222">
     <w:abstractNumId w:val="6"/>
   </w:num>
-  <w:num w:numId="3" w16cid:durableId="1404644713">
+  <w:num w:numId="3" w16cid:durableId="1397820208">
     <w:abstractNumId w:val="5"/>
   </w:num>
-  <w:num w:numId="4" w16cid:durableId="276761827">
+  <w:num w:numId="4" w16cid:durableId="958416164">
     <w:abstractNumId w:val="4"/>
   </w:num>
-  <w:num w:numId="5" w16cid:durableId="1299916252">
+  <w:num w:numId="5" w16cid:durableId="164173552">
     <w:abstractNumId w:val="7"/>
   </w:num>
-  <w:num w:numId="6" w16cid:durableId="899563412">
+  <w:num w:numId="6" w16cid:durableId="1796870281">
     <w:abstractNumId w:val="3"/>
   </w:num>
-  <w:num w:numId="7" w16cid:durableId="1891917411">
+  <w:num w:numId="7" w16cid:durableId="693271066">
     <w:abstractNumId w:val="2"/>
   </w:num>
-  <w:num w:numId="8" w16cid:durableId="1098645981">
+  <w:num w:numId="8" w16cid:durableId="1221285420">
     <w:abstractNumId w:val="1"/>
   </w:num>
-  <w:num w:numId="9" w16cid:durableId="11957121">
+  <w:num w:numId="9" w16cid:durableId="760220585">
     <w:abstractNumId w:val="0"/>
   </w:num>
-  <w:num w:numId="10" w16cid:durableId="985477881">
+  <w:num w:numId="10" w16cid:durableId="1582059315">
     <w:abstractNumId w:val="9"/>
   </w:num>
-  <w:num w:numId="11" w16cid:durableId="1644461449">
+  <w:num w:numId="11" w16cid:durableId="1063604205">
     <w:abstractNumId w:val="10"/>
   </w:num>
-  <w:num w:numId="12" w16cid:durableId="337736329">
+  <w:num w:numId="12" w16cid:durableId="1789469626">
     <w:abstractNumId w:val="11"/>
     <w:lvlOverride w:ilvl="0">
       <w:startOverride w:val="1"/>
@@ -7318,7 +7318,7 @@
       <w:startOverride w:val="1"/>
     </w:lvlOverride>
   </w:num>
-  <w:num w:numId="13" w16cid:durableId="1274172016">
+  <w:num w:numId="13" w16cid:durableId="1526556546">
     <w:abstractNumId w:val="12"/>
     <w:lvlOverride w:ilvl="0">
       <w:startOverride w:val="3"/>
@@ -7348,31 +7348,31 @@
       <w:startOverride w:val="3"/>
     </w:lvlOverride>
   </w:num>
-  <w:num w:numId="14" w16cid:durableId="1469283347">
+  <w:num w:numId="14" w16cid:durableId="1100949751">
     <w:abstractNumId w:val="10"/>
   </w:num>
-  <w:num w:numId="15" w16cid:durableId="656883279">
+  <w:num w:numId="15" w16cid:durableId="185826537">
     <w:abstractNumId w:val="10"/>
   </w:num>
-  <w:num w:numId="16" w16cid:durableId="417946347">
+  <w:num w:numId="16" w16cid:durableId="648435506">
     <w:abstractNumId w:val="10"/>
   </w:num>
-  <w:num w:numId="17" w16cid:durableId="1446927428">
+  <w:num w:numId="17" w16cid:durableId="1294402789">
     <w:abstractNumId w:val="10"/>
   </w:num>
-  <w:num w:numId="18" w16cid:durableId="504439253">
+  <w:num w:numId="18" w16cid:durableId="1665860946">
     <w:abstractNumId w:val="10"/>
   </w:num>
-  <w:num w:numId="19" w16cid:durableId="1895658419">
+  <w:num w:numId="19" w16cid:durableId="1040401347">
     <w:abstractNumId w:val="10"/>
   </w:num>
-  <w:num w:numId="20" w16cid:durableId="297029376">
+  <w:num w:numId="20" w16cid:durableId="2004161974">
     <w:abstractNumId w:val="10"/>
   </w:num>
-  <w:num w:numId="21" w16cid:durableId="1989822240">
+  <w:num w:numId="21" w16cid:durableId="144663716">
     <w:abstractNumId w:val="10"/>
   </w:num>
-  <w:num w:numId="22" w16cid:durableId="1172376165">
+  <w:num w:numId="22" w16cid:durableId="979262933">
     <w:abstractNumId w:val="11"/>
     <w:lvlOverride w:ilvl="0">
       <w:startOverride w:val="1"/>
@@ -7402,19 +7402,19 @@
       <w:startOverride w:val="1"/>
     </w:lvlOverride>
   </w:num>
-  <w:num w:numId="23" w16cid:durableId="1680809413">
+  <w:num w:numId="23" w16cid:durableId="1944070151">
     <w:abstractNumId w:val="10"/>
   </w:num>
-  <w:num w:numId="24" w16cid:durableId="130749479">
+  <w:num w:numId="24" w16cid:durableId="1286698496">
     <w:abstractNumId w:val="10"/>
   </w:num>
-  <w:num w:numId="25" w16cid:durableId="1100489725">
+  <w:num w:numId="25" w16cid:durableId="760762836">
     <w:abstractNumId w:val="10"/>
   </w:num>
-  <w:num w:numId="26" w16cid:durableId="544951229">
+  <w:num w:numId="26" w16cid:durableId="1464032424">
     <w:abstractNumId w:val="10"/>
   </w:num>
-  <w:num w:numId="27" w16cid:durableId="1145321392">
+  <w:num w:numId="27" w16cid:durableId="1721392543">
     <w:abstractNumId w:val="10"/>
   </w:num>
 </w:numbering>
@@ -19235,7 +19235,7 @@
     <w:autoRedefine/>
     <w:uiPriority w:val="39"/>
     <w:unhideWhenUsed/>
-    <w:rsid w:val="004D6D3C"/>
+    <w:rsid w:val="006046EF"/>
     <w:pPr>
       <w:spacing w:after="100"/>
     </w:pPr>
@@ -19247,7 +19247,7 @@
     <w:autoRedefine/>
     <w:uiPriority w:val="39"/>
     <w:unhideWhenUsed/>
-    <w:rsid w:val="004D6D3C"/>
+    <w:rsid w:val="006046EF"/>
     <w:pPr>
       <w:spacing w:after="100"/>
       <w:ind w:left="220"/>
@@ -19258,7 +19258,7 @@
     <w:basedOn w:val="DefaultParagraphFont"/>
     <w:uiPriority w:val="99"/>
     <w:unhideWhenUsed/>
-    <w:rsid w:val="004D6D3C"/>
+    <w:rsid w:val="006046EF"/>
     <w:rPr>
       <w:color w:val="0000FF" w:themeColor="hyperlink"/>
       <w:u w:val="single"/>

</xml_diff>